<commit_message>
Rewrite cover letter in Paper-10 crisp format (LaTeX source + .pdf/.docx)
Three tight paragraphs (pitch+headline results, journal fit + reproducibility, admin)
with corresponding-author signature, mirroring the Frontiers cover-letter style. Folds
the SR-required prior-EBM-discussion and no-exclusions statements into one line. Replaces
the earlier verbose COVER_LETTER.md; submittable artifacts are COVER_LETTER.pdf/.docx.
</commit_message>
<xml_diff>
--- a/paper/scientific_reports/COVER_LETTER.docx
+++ b/paper/scientific_reports/COVER_LETTER.docx
@@ -4,30 +4,35 @@
   <w:body>
     <w:p>
       <w:pPr>
-        <w:pStyle w:val="Heading1"/>
-      </w:pPr>
-      <w:bookmarkStart w:id="20" w:name="cover-letter-scientific-reports"/>
-      <w:r>
-        <w:t xml:space="preserve">Cover letter — Scientific Reports</w:t>
-      </w:r>
-      <w:bookmarkEnd w:id="20"/>
+        <w:pStyle w:val="FirstParagraph"/>
+      </w:pPr>
+      <w:r>
+        <w:t xml:space="preserve">To the Editors</w:t>
+      </w:r>
+      <w:r>
+        <w:br/>
+      </w:r>
+      <w:r>
+        <w:rPr>
+          <w:i/>
+        </w:rPr>
+        <w:t xml:space="preserve">Scientific Reports</w:t>
+      </w:r>
     </w:p>
     <w:p>
       <w:pPr>
-        <w:pStyle w:val="FirstParagraph"/>
-      </w:pPr>
-      <w:r>
-        <w:t xml:space="preserve">Dear Editors,</w:t>
-      </w:r>
-    </w:p>
-    <w:p>
-      <w:pPr>
         <w:pStyle w:val="BodyText"/>
       </w:pPr>
       <w:r>
-        <w:t xml:space="preserve">We submit our manuscript,</w:t>
-      </w:r>
-      <w:r>
+        <w:rPr>
+          <w:b/>
+        </w:rPr>
+        <w:t xml:space="preserve">Re: Article submission —</w:t>
+      </w:r>
+      <w:r>
+        <w:rPr>
+          <w:b/>
+        </w:rPr>
         <w:t xml:space="preserve"> </w:t>
       </w:r>
       <w:r>
@@ -40,7 +45,7 @@
         <w:rPr>
           <w:b/>
         </w:rPr>
-        <w:t xml:space="preserve">Sensitivity of AI-Generated Credit Ratings to Elicitation Choices,</w:t>
+        <w:t xml:space="preserve">Sensitivity of AI-Generated Credit Ratings to Elicitation Choices.</w:t>
       </w:r>
       <w:r>
         <w:rPr>
@@ -48,11 +53,21 @@
         </w:rPr>
         <w:t xml:space="preserve">”</w:t>
       </w:r>
-      <w:r>
-        <w:t xml:space="preserve"> </w:t>
-      </w:r>
-      <w:r>
-        <w:t xml:space="preserve">for consideration as an Article in</w:t>
+    </w:p>
+    <w:p>
+      <w:pPr>
+        <w:pStyle w:val="BodyText"/>
+      </w:pPr>
+      <w:r>
+        <w:t xml:space="preserve">Dear Editors,</w:t>
+      </w:r>
+    </w:p>
+    <w:p>
+      <w:pPr>
+        <w:pStyle w:val="BodyText"/>
+      </w:pPr>
+      <w:r>
+        <w:t xml:space="preserve">We are pleased to submit the above manuscript for consideration as an Article in</w:t>
       </w:r>
       <w:r>
         <w:t xml:space="preserve"> </w:t>
@@ -64,7 +79,92 @@
         <w:t xml:space="preserve">Scientific Reports</w:t>
       </w:r>
       <w:r>
-        <w:t xml:space="preserve">.</w:t>
+        <w:t xml:space="preserve">. Using a pre-registered specification-curve design, we measure whether large-language-model credit ratings are stable when the underlying financial information is held fixed but the elicitation specification varies. Across a fixed 90-item battery crossed with a factorial grid of provider, model version, temperature, prompt paraphrase, output format, few-shot exemplars, and presentation (</w:t>
+      </w:r>
+      <m:oMath>
+        <m:r>
+          <m:t>12</m:t>
+        </m:r>
+        <m:r>
+          <m:t>,</m:t>
+        </m:r>
+        <m:r>
+          <m:t>960</m:t>
+        </m:r>
+      </m:oMath>
+      <w:r>
+        <w:t xml:space="preserve"> </w:t>
+      </w:r>
+      <w:r>
+        <w:t xml:space="preserve">elicitations across three model families), no controllable elicitation axis explains more than about</w:t>
+      </w:r>
+      <w:r>
+        <w:t xml:space="preserve"> </w:t>
+      </w:r>
+      <m:oMath>
+        <m:r>
+          <m:t>5</m:t>
+        </m:r>
+        <m:r>
+          <m:t>%</m:t>
+        </m:r>
+      </m:oMath>
+      <w:r>
+        <w:t xml:space="preserve"> </w:t>
+      </w:r>
+      <w:r>
+        <w:t xml:space="preserve">of rating variance, the instability survives verified deterministic execution (permutation</w:t>
+      </w:r>
+      <w:r>
+        <w:t xml:space="preserve"> </w:t>
+      </w:r>
+      <m:oMath>
+        <m:r>
+          <m:t>p</m:t>
+        </m:r>
+        <m:r>
+          <m:t>=</m:t>
+        </m:r>
+        <m:r>
+          <m:t>0.001</m:t>
+        </m:r>
+      </m:oMath>
+      <w:r>
+        <w:t xml:space="preserve">), and</w:t>
+      </w:r>
+      <w:r>
+        <w:t xml:space="preserve"> </w:t>
+      </w:r>
+      <m:oMath>
+        <m:r>
+          <m:t>26.8</m:t>
+        </m:r>
+        <m:r>
+          <m:t>%</m:t>
+        </m:r>
+      </m:oMath>
+      <w:r>
+        <w:t xml:space="preserve"> </w:t>
+      </w:r>
+      <w:r>
+        <w:t xml:space="preserve">of matched elicitation pairs disagree at the investment-grade/high-yield boundary. We translate this into decision-relevant units —</w:t>
+      </w:r>
+      <w:r>
+        <w:t xml:space="preserve"> </w:t>
+      </w:r>
+      <m:oMath>
+        <m:r>
+          <m:t>56.8</m:t>
+        </m:r>
+        <m:r>
+          <m:t>%</m:t>
+        </m:r>
+      </m:oMath>
+      <w:r>
+        <w:t xml:space="preserve"> </w:t>
+      </w:r>
+      <w:r>
+        <w:t xml:space="preserve">implied portfolio turnover and a $2.0–4.2bn Pillar-1 capital range on the same $45bn book — and show the pattern persists on 31 decontaminated real issuers under a pre-registered fingerprinting gate. Our estimand throughout is rating stability, not accuracy.</w:t>
       </w:r>
     </w:p>
     <w:p>
@@ -72,183 +172,7 @@
         <w:pStyle w:val="BodyText"/>
       </w:pPr>
       <w:r>
-        <w:t xml:space="preserve">Large language models are increasingly used as credit, risk, and trading analysts, on the tacit</w:t>
-      </w:r>
-      <w:r>
-        <w:t xml:space="preserve"> </w:t>
-      </w:r>
-      <w:r>
-        <w:t xml:space="preserve">assumption that a model holds a stable latent assessment that the prompt merely reads out. We test</w:t>
-      </w:r>
-      <w:r>
-        <w:t xml:space="preserve"> </w:t>
-      </w:r>
-      <w:r>
-        <w:t xml:space="preserve">that assumption directly with a</w:t>
-      </w:r>
-      <w:r>
-        <w:t xml:space="preserve"> </w:t>
-      </w:r>
-      <w:r>
-        <w:rPr>
-          <w:b/>
-        </w:rPr>
-        <w:t xml:space="preserve">pre-registered specification-curve design</w:t>
-      </w:r>
-      <w:r>
-        <w:t xml:space="preserve">: a fixed 90-item</w:t>
-      </w:r>
-      <w:r>
-        <w:t xml:space="preserve"> </w:t>
-      </w:r>
-      <w:r>
-        <w:t xml:space="preserve">firm-profile battery with an objective Altman Z’’ benchmark, crossed with a factorial grid of</w:t>
-      </w:r>
-      <w:r>
-        <w:t xml:space="preserve"> </w:t>
-      </w:r>
-      <w:r>
-        <w:t xml:space="preserve">defensible elicitation choices (provider, model version, temperature, prompt paraphrase, output</w:t>
-      </w:r>
-      <w:r>
-        <w:t xml:space="preserve"> </w:t>
-      </w:r>
-      <w:r>
-        <w:t xml:space="preserve">format, few-shot exemplars, and answer presentation), replicated across seeds and three model</w:t>
-      </w:r>
-      <w:r>
-        <w:t xml:space="preserve"> </w:t>
-      </w:r>
-      <w:r>
-        <w:t xml:space="preserve">families (12,960 elicitations). We find that although firm fundamentals explain most rating</w:t>
-      </w:r>
-      <w:r>
-        <w:t xml:space="preserve"> </w:t>
-      </w:r>
-      <w:r>
-        <w:t xml:space="preserve">variation, the machine credit rating retains economically meaningful sensitivity to defensible</w:t>
-      </w:r>
-      <w:r>
-        <w:t xml:space="preserve"> </w:t>
-      </w:r>
-      <w:r>
-        <w:t xml:space="preserve">elicitation choices and to residual run-to-run variation, more than to any single tunable design</w:t>
-      </w:r>
-      <w:r>
-        <w:t xml:space="preserve"> </w:t>
-      </w:r>
-      <w:r>
-        <w:t xml:space="preserve">choice; that the fragility survives honored determinism and cannot be escaped by switching or</w:t>
-      </w:r>
-      <w:r>
-        <w:t xml:space="preserve"> </w:t>
-      </w:r>
-      <w:r>
-        <w:t xml:space="preserve">pooling vendors; and that the opinion holds no stable rating resolution, crossing the</w:t>
-      </w:r>
-      <w:r>
-        <w:t xml:space="preserve"> </w:t>
-      </w:r>
-      <w:r>
-        <w:t xml:space="preserve">investment-grade/high-yield line on 27% of matched elicitation pairs. We translate this into the</w:t>
-      </w:r>
-      <w:r>
-        <w:t xml:space="preserve"> </w:t>
-      </w:r>
-      <w:r>
-        <w:t xml:space="preserve">units a risk function acts on—portfolio turnover, credit spread, and a post-hoc Basel capital</w:t>
-      </w:r>
-      <w:r>
-        <w:t xml:space="preserve"> </w:t>
-      </w:r>
-      <w:r>
-        <w:t xml:space="preserve">recast—and, to answer the</w:t>
-      </w:r>
-      <w:r>
-        <w:t xml:space="preserve"> </w:t>
-      </w:r>
-      <w:r>
-        <w:t xml:space="preserve">“</w:t>
-      </w:r>
-      <w:r>
-        <w:t xml:space="preserve">use real data</w:t>
-      </w:r>
-      <w:r>
-        <w:t xml:space="preserve">”</w:t>
-      </w:r>
-      <w:r>
-        <w:t xml:space="preserve"> </w:t>
-      </w:r>
-      <w:r>
-        <w:t xml:space="preserve">objection, we first</w:t>
-      </w:r>
-      <w:r>
-        <w:t xml:space="preserve"> </w:t>
-      </w:r>
-      <w:r>
-        <w:rPr>
-          <w:b/>
-        </w:rPr>
-        <w:t xml:space="preserve">demonstrate that naive real-firm LLM</w:t>
-      </w:r>
-      <w:r>
-        <w:rPr>
-          <w:b/>
-        </w:rPr>
-        <w:t xml:space="preserve"> </w:t>
-      </w:r>
-      <w:r>
-        <w:rPr>
-          <w:b/>
-        </w:rPr>
-        <w:t xml:space="preserve">evaluation can be contaminated by memorization</w:t>
-      </w:r>
-      <w:r>
-        <w:t xml:space="preserve"> </w:t>
-      </w:r>
-      <w:r>
-        <w:t xml:space="preserve">and then show, under a pre-registered fingerprinting</w:t>
-      </w:r>
-      <w:r>
-        <w:t xml:space="preserve"> </w:t>
-      </w:r>
-      <w:r>
-        <w:t xml:space="preserve">decontamination gate, that</w:t>
-      </w:r>
-      <w:r>
-        <w:t xml:space="preserve"> </w:t>
-      </w:r>
-      <w:r>
-        <w:rPr>
-          <w:b/>
-        </w:rPr>
-        <w:t xml:space="preserve">substantial specification instability is also observed on real</w:t>
-      </w:r>
-      <w:r>
-        <w:rPr>
-          <w:b/>
-        </w:rPr>
-        <w:t xml:space="preserve"> </w:t>
-      </w:r>
-      <w:r>
-        <w:rPr>
-          <w:b/>
-        </w:rPr>
-        <w:t xml:space="preserve">anonymized issuers</w:t>
-      </w:r>
-      <w:r>
-        <w:t xml:space="preserve"> </w:t>
-      </w:r>
-      <w:r>
-        <w:t xml:space="preserve">benchmarked to disclosed agency ratings.</w:t>
-      </w:r>
-    </w:p>
-    <w:p>
-      <w:pPr>
-        <w:pStyle w:val="BodyText"/>
-      </w:pPr>
-      <w:r>
-        <w:t xml:space="preserve">We believe the work fits</w:t>
+        <w:t xml:space="preserve">The work fits</w:t>
       </w:r>
       <w:r>
         <w:t xml:space="preserve"> </w:t>
@@ -263,91 +187,7 @@
         <w:t xml:space="preserve"> </w:t>
       </w:r>
       <w:r>
-        <w:t xml:space="preserve">for three reasons. (i)</w:t>
-      </w:r>
-      <w:r>
-        <w:t xml:space="preserve"> </w:t>
-      </w:r>
-      <w:r>
-        <w:rPr>
-          <w:b/>
-        </w:rPr>
-        <w:t xml:space="preserve">Broad relevance</w:t>
-      </w:r>
-      <w:r>
-        <w:t xml:space="preserve">: it concerns</w:t>
-      </w:r>
-      <w:r>
-        <w:t xml:space="preserve"> </w:t>
-      </w:r>
-      <w:r>
-        <w:t xml:space="preserve">the reliability of AI decision systems in a high-stakes deployment, of interest across machine</w:t>
-      </w:r>
-      <w:r>
-        <w:t xml:space="preserve"> </w:t>
-      </w:r>
-      <w:r>
-        <w:t xml:space="preserve">learning, finance, and metascience. (ii)</w:t>
-      </w:r>
-      <w:r>
-        <w:t xml:space="preserve"> </w:t>
-      </w:r>
-      <w:r>
-        <w:rPr>
-          <w:b/>
-        </w:rPr>
-        <w:t xml:space="preserve">Methodological rigor</w:t>
-      </w:r>
-      <w:r>
-        <w:t xml:space="preserve">: the design is pre-registered, the</w:t>
-      </w:r>
-      <w:r>
-        <w:t xml:space="preserve"> </w:t>
-      </w:r>
-      <w:r>
-        <w:t xml:space="preserve">analyses are confirmatory with permutation tests and cluster-bootstrap intervals, and the</w:t>
-      </w:r>
-      <w:r>
-        <w:t xml:space="preserve"> </w:t>
-      </w:r>
-      <w:r>
-        <w:t xml:space="preserve">decontamination gate is, to our knowledge, the first direct evidence that anonymized real-firm LLM</w:t>
-      </w:r>
-      <w:r>
-        <w:t xml:space="preserve"> </w:t>
-      </w:r>
-      <w:r>
-        <w:t xml:space="preserve">evaluation can be memorization-contaminated even without names in the prompt. (iii)</w:t>
-      </w:r>
-      <w:r>
-        <w:t xml:space="preserve"> </w:t>
-      </w:r>
-      <w:r>
-        <w:rPr>
-          <w:b/>
-        </w:rPr>
-        <w:t xml:space="preserve">Full</w:t>
-      </w:r>
-      <w:r>
-        <w:rPr>
-          <w:b/>
-        </w:rPr>
-        <w:t xml:space="preserve"> </w:t>
-      </w:r>
-      <w:r>
-        <w:rPr>
-          <w:b/>
-        </w:rPr>
-        <w:t xml:space="preserve">reproducibility</w:t>
-      </w:r>
-      <w:r>
-        <w:t xml:space="preserve">: the entire 12,960-response corpus, code, and manifest hashes are released; every</w:t>
-      </w:r>
-      <w:r>
-        <w:t xml:space="preserve"> </w:t>
-      </w:r>
-      <w:r>
-        <w:t xml:space="preserve">reported number regenerates offline and byte-for-byte from the frozen data.</w:t>
+        <w:t xml:space="preserve">through its broad relevance to the reliability of AI decision systems and its methodological rigor: the design is pre-registered, inference is distribution-free, and a deterministic, offline reproducibility capsule (Code Ocean DOI assigned at deposit; MIT license) regenerates every reported number, table, and figure byte-for-byte. The study uses only synthetic firm profiles and publicly available SEC filings, involves no human or animal subjects, and discloses its use of generative-AI assistance in the Methods.</w:t>
       </w:r>
     </w:p>
     <w:p>
@@ -355,19 +195,22 @@
         <w:pStyle w:val="BodyText"/>
       </w:pPr>
       <w:r>
-        <w:t xml:space="preserve">The manuscript is original, not under consideration elsewhere, and all authors approve the</w:t>
+        <w:t xml:space="preserve">The manuscript is original, is not under consideration elsewhere, and has been approved by both authors, who declare no competing interests and received no external funding. We have not discussed this work with a</w:t>
       </w:r>
       <w:r>
         <w:t xml:space="preserve"> </w:t>
       </w:r>
       <w:r>
-        <w:t xml:space="preserve">submission. We declare no competing interests. The corresponding author is Robin Chawla</w:t>
+        <w:rPr>
+          <w:i/>
+        </w:rPr>
+        <w:t xml:space="preserve">Scientific Reports</w:t>
       </w:r>
       <w:r>
         <w:t xml:space="preserve"> </w:t>
       </w:r>
       <w:r>
-        <w:t xml:space="preserve">(robin.chawla.cse14@iitbhu.ac.in).</w:t>
+        <w:t xml:space="preserve">Editorial Board Member and request no referee exclusions. Thank you for your consideration.</w:t>
       </w:r>
     </w:p>
     <w:p>
@@ -375,16 +218,7 @@
         <w:pStyle w:val="BodyText"/>
       </w:pPr>
       <w:r>
-        <w:rPr>
-          <w:b/>
-        </w:rPr>
-        <w:t xml:space="preserve">Referees to exclude.</w:t>
-      </w:r>
-      <w:r>
-        <w:t xml:space="preserve"> </w:t>
-      </w:r>
-      <w:r>
-        <w:t xml:space="preserve">None.</w:t>
+        <w:t xml:space="preserve">Sincerely,</w:t>
       </w:r>
     </w:p>
     <w:p>
@@ -392,51 +226,25 @@
         <w:pStyle w:val="BodyText"/>
       </w:pPr>
       <w:r>
-        <w:rPr>
-          <w:b/>
-        </w:rPr>
-        <w:t xml:space="preserve">Prior discussions.</w:t>
-      </w:r>
-      <w:r>
-        <w:t xml:space="preserve"> </w:t>
-      </w:r>
-      <w:r>
-        <w:t xml:space="preserve">We have not had any prior discussions with a Scientific Reports Editorial</w:t>
-      </w:r>
-      <w:r>
-        <w:t xml:space="preserve"> </w:t>
-      </w:r>
-      <w:r>
-        <w:t xml:space="preserve">Board Member about the work described in this manuscript.</w:t>
-      </w:r>
-    </w:p>
-    <w:p>
-      <w:pPr>
-        <w:pStyle w:val="BodyText"/>
-      </w:pPr>
-      <w:r>
-        <w:t xml:space="preserve">Thank you for your consideration.</w:t>
-      </w:r>
-    </w:p>
-    <w:p>
-      <w:pPr>
-        <w:pStyle w:val="BodyText"/>
-      </w:pPr>
-      <w:r>
-        <w:t xml:space="preserve">Sincerely,</w:t>
-      </w:r>
-      <w:r>
-        <w:t xml:space="preserve"> </w:t>
-      </w:r>
-      <w:r>
-        <w:t xml:space="preserve">Samir Chincholikar and Robin Chawla</w:t>
-      </w:r>
-      <w:r>
-        <w:t xml:space="preserve"> </w:t>
-      </w:r>
-      <w:r>
-        <w:t xml:space="preserve">Independent researchers, New York, USA</w:t>
-      </w:r>
+        <w:t xml:space="preserve">Robin Chawla</w:t>
+      </w:r>
+      <w:r>
+        <w:br/>
+      </w:r>
+      <w:r>
+        <w:t xml:space="preserve">Corresponding Author (on behalf of Samir Chincholikar and Robin Chawla)</w:t>
+      </w:r>
+      <w:r>
+        <w:br/>
+      </w:r>
+      <w:hyperlink r:id="rId20">
+        <w:r>
+          <w:rPr>
+            <w:rStyle w:val="Hyperlink"/>
+          </w:rPr>
+          <w:t xml:space="preserve">robin.chawla.cse14@iitbhu.ac.in</w:t>
+        </w:r>
+      </w:hyperlink>
     </w:p>
     <w:sectPr/>
   </w:body>

</xml_diff>

<commit_message>
Insert Zenodo DOI 10.5281/zenodo.21953935 across all files
Replace the 'assigned/minted at deposit' placeholder with the live archive DOI in:
manuscript Data Availability, cover letter, README, DATA_AVAILABILITY.md, CITATION.cff
(doi + identifiers), and the internal submission checklist. Regenerated manuscript and
cover-letter PDF/DOCX; DOI verified present in all four deliverables. Compiles clean
(0 undefined, 20 pp).
</commit_message>
<xml_diff>
--- a/paper/scientific_reports/COVER_LETTER.docx
+++ b/paper/scientific_reports/COVER_LETTER.docx
@@ -187,7 +187,18 @@
         <w:t xml:space="preserve"> </w:t>
       </w:r>
       <w:r>
-        <w:t xml:space="preserve">through its broad relevance to the reliability of AI decision systems and its methodological rigor: the design is pre-registered, inference is distribution-free, and a deterministic, offline reproducibility capsule (Code Ocean DOI assigned at deposit; MIT license) regenerates every reported number, table, and figure byte-for-byte. The study uses only synthetic firm profiles and publicly available SEC filings, involves no human or animal subjects, and discloses its use of generative-AI assistance in the Methods.</w:t>
+        <w:t xml:space="preserve">through its broad relevance to the reliability of AI decision systems and its methodological rigor: the design is pre-registered, inference is distribution-free, and a deterministic, offline reproducibility capsule archived on Zenodo (</w:t>
+      </w:r>
+      <w:hyperlink r:id="rId20">
+        <w:r>
+          <w:rPr>
+            <w:rStyle w:val="Hyperlink"/>
+          </w:rPr>
+          <w:t xml:space="preserve">https://doi.org/10.5281/zenodo.21953935</w:t>
+        </w:r>
+      </w:hyperlink>
+      <w:r>
+        <w:t xml:space="preserve">; MIT license) regenerates every reported number, table, and figure byte-for-byte. The study uses only synthetic firm profiles and publicly available SEC filings, involves no human or animal subjects, and discloses its use of generative-AI assistance in the Methods.</w:t>
       </w:r>
     </w:p>
     <w:p>
@@ -237,7 +248,7 @@
       <w:r>
         <w:br/>
       </w:r>
-      <w:hyperlink r:id="rId20">
+      <w:hyperlink r:id="rId21">
         <w:r>
           <w:rPr>
             <w:rStyle w:val="Hyperlink"/>

</xml_diff>